<commit_message>
docs: embed live implementation screenshots (UI dashboard, allergen scanner, recipe generator) into PBL report DOCX
</commit_message>
<xml_diff>
--- a/SafeBite_PBL_Report.docx
+++ b/SafeBite_PBL_Report.docx
@@ -284,7 +284,7 @@
           <w:sz w:val="28"/>
           <w:szCs w:val="28"/>
         </w:rPr>
-        <w:t xml:space="preserve">AGENTIC ARTIFICIAL INTELLIGENCE</w:t>
+        <w:t xml:space="preserve">ARTIFICIAL INTELLIGENCE</w:t>
       </w:r>
     </w:p>
     <w:p>
@@ -309,7 +309,7 @@
           <w:sz w:val="24"/>
           <w:szCs w:val="24"/>
         </w:rPr>
-        <w:t xml:space="preserve">Submitted To:  Prof. Deepika Sharma</w:t>
+        <w:t xml:space="preserve">Submitted To:  Prof. Smita Barne</w:t>
       </w:r>
     </w:p>
     <w:p>
@@ -863,7 +863,7 @@
                 <w:rFonts w:ascii="Times New Roman" w:hAnsi="Times New Roman"/>
                 <w:sz w:val="20"/>
               </w:rPr>
-              <w:t>Prof. Deepika Sharma</w:t>
+              <w:t>Prof. Smita Barne</w:t>
             </w:r>
           </w:p>
         </w:tc>
@@ -993,8 +993,8 @@
         </w:tblCellMar>
       </w:tblPr>
       <w:tblGrid>
-        <w:gridCol w:w="1600"/>
-        <w:gridCol w:w="6400"/>
+        <w:gridCol w:w="1800"/>
+        <w:gridCol w:w="6200"/>
         <w:gridCol w:w="1200"/>
       </w:tblGrid>
       <w:tr>
@@ -1003,7 +1003,7 @@
         </w:trPr>
         <w:tc>
           <w:tcPr>
-            <w:tcW w:w="1600" w:type="dxa"/>
+            <w:tcW w:w="1800" w:type="dxa"/>
             <w:shd w:val="clear" w:color="auto" w:fill="F2F2F2"/>
             <w:vAlign w:val="center"/>
           </w:tcPr>
@@ -1029,7 +1029,7 @@
         </w:tc>
         <w:tc>
           <w:tcPr>
-            <w:tcW w:w="6400" w:type="dxa"/>
+            <w:tcW w:w="6200" w:type="dxa"/>
             <w:shd w:val="clear" w:color="auto" w:fill="F2F2F2"/>
             <w:vAlign w:val="center"/>
           </w:tcPr>
@@ -1083,7 +1083,7 @@
       <w:tr>
         <w:tc>
           <w:tcPr>
-            <w:tcW w:w="1600" w:type="dxa"/>
+            <w:tcW w:w="1800" w:type="dxa"/>
             <w:vAlign w:val="center"/>
           </w:tcPr>
           <w:p>
@@ -1106,7 +1106,7 @@
         </w:tc>
         <w:tc>
           <w:tcPr>
-            <w:tcW w:w="6400" w:type="dxa"/>
+            <w:tcW w:w="6200" w:type="dxa"/>
             <w:vAlign w:val="center"/>
           </w:tcPr>
           <w:p>
@@ -1146,7 +1146,7 @@
                 <w:rFonts w:ascii="Times New Roman" w:hAnsi="Times New Roman"/>
                 <w:sz w:val="20"/>
               </w:rPr>
-              <w:t>10</w:t>
+              <w:t>13</w:t>
             </w:r>
           </w:p>
         </w:tc>
@@ -1154,7 +1154,7 @@
       <w:tr>
         <w:tc>
           <w:tcPr>
-            <w:tcW w:w="1600" w:type="dxa"/>
+            <w:tcW w:w="1800" w:type="dxa"/>
             <w:vAlign w:val="center"/>
           </w:tcPr>
           <w:p>
@@ -1177,24 +1177,24 @@
         </w:tc>
         <w:tc>
           <w:tcPr>
-            <w:tcW w:w="6400" w:type="dxa"/>
-            <w:vAlign w:val="center"/>
-          </w:tcPr>
-          <w:p>
-            <w:pPr>
-              <w:spacing w:before="60" w:after="60" w:line="240" w:lineRule="auto"/>
-              <w:jc w:val="left"/>
-              <w:rPr>
-                <w:rFonts w:ascii="Times New Roman" w:hAnsi="Times New Roman"/>
-                <w:sz w:val="20"/>
-              </w:rPr>
-            </w:pPr>
-            <w:r>
-              <w:rPr>
-                <w:rFonts w:ascii="Times New Roman" w:hAnsi="Times New Roman"/>
-                <w:sz w:val="20"/>
-              </w:rPr>
-              <w:t>Roommate Profile Configuration &amp; Reaction Severity Thresholds</w:t>
+            <w:tcW w:w="6200" w:type="dxa"/>
+            <w:vAlign w:val="center"/>
+          </w:tcPr>
+          <w:p>
+            <w:pPr>
+              <w:spacing w:before="60" w:after="60" w:line="240" w:lineRule="auto"/>
+              <w:jc w:val="left"/>
+              <w:rPr>
+                <w:rFonts w:ascii="Times New Roman" w:hAnsi="Times New Roman"/>
+                <w:sz w:val="20"/>
+              </w:rPr>
+            </w:pPr>
+            <w:r>
+              <w:rPr>
+                <w:rFonts w:ascii="Times New Roman" w:hAnsi="Times New Roman"/>
+                <w:sz w:val="20"/>
+              </w:rPr>
+              <w:t>Ingredient Allergen Scanner Catching Hidden Derivative Toxins</w:t>
             </w:r>
           </w:p>
         </w:tc>
@@ -1217,7 +1217,7 @@
                 <w:rFonts w:ascii="Times New Roman" w:hAnsi="Times New Roman"/>
                 <w:sz w:val="20"/>
               </w:rPr>
-              <w:t>10</w:t>
+              <w:t>14</w:t>
             </w:r>
           </w:p>
         </w:tc>
@@ -1225,7 +1225,7 @@
       <w:tr>
         <w:tc>
           <w:tcPr>
-            <w:tcW w:w="1600" w:type="dxa"/>
+            <w:tcW w:w="1800" w:type="dxa"/>
             <w:vAlign w:val="center"/>
           </w:tcPr>
           <w:p>
@@ -1248,24 +1248,24 @@
         </w:tc>
         <w:tc>
           <w:tcPr>
-            <w:tcW w:w="6400" w:type="dxa"/>
-            <w:vAlign w:val="center"/>
-          </w:tcPr>
-          <w:p>
-            <w:pPr>
-              <w:spacing w:before="60" w:after="60" w:line="240" w:lineRule="auto"/>
-              <w:jc w:val="left"/>
-              <w:rPr>
-                <w:rFonts w:ascii="Times New Roman" w:hAnsi="Times New Roman"/>
-                <w:sz w:val="20"/>
-              </w:rPr>
-            </w:pPr>
-            <w:r>
-              <w:rPr>
-                <w:rFonts w:ascii="Times New Roman" w:hAnsi="Times New Roman"/>
-                <w:sz w:val="20"/>
-              </w:rPr>
-              <w:t>Ingredient Allergen Scanner Result Catching Hidden Derivative Toxins</w:t>
+            <w:tcW w:w="6200" w:type="dxa"/>
+            <w:vAlign w:val="center"/>
+          </w:tcPr>
+          <w:p>
+            <w:pPr>
+              <w:spacing w:before="60" w:after="60" w:line="240" w:lineRule="auto"/>
+              <w:jc w:val="left"/>
+              <w:rPr>
+                <w:rFonts w:ascii="Times New Roman" w:hAnsi="Times New Roman"/>
+                <w:sz w:val="20"/>
+              </w:rPr>
+            </w:pPr>
+            <w:r>
+              <w:rPr>
+                <w:rFonts w:ascii="Times New Roman" w:hAnsi="Times New Roman"/>
+                <w:sz w:val="20"/>
+              </w:rPr>
+              <w:t>Safe Pantry-to-Plate Recipe Generation with Cross-Contamination Directives</w:t>
             </w:r>
           </w:p>
         </w:tc>
@@ -1288,291 +1288,7 @@
                 <w:rFonts w:ascii="Times New Roman" w:hAnsi="Times New Roman"/>
                 <w:sz w:val="20"/>
               </w:rPr>
-              <w:t>11</w:t>
-            </w:r>
-          </w:p>
-        </w:tc>
-      </w:tr>
-      <w:tr>
-        <w:tc>
-          <w:tcPr>
-            <w:tcW w:w="1600" w:type="dxa"/>
-            <w:vAlign w:val="center"/>
-          </w:tcPr>
-          <w:p>
-            <w:pPr>
-              <w:spacing w:before="60" w:after="60" w:line="240" w:lineRule="auto"/>
-              <w:jc w:val="left"/>
-              <w:rPr>
-                <w:rFonts w:ascii="Times New Roman" w:hAnsi="Times New Roman"/>
-                <w:sz w:val="20"/>
-              </w:rPr>
-            </w:pPr>
-            <w:r>
-              <w:rPr>
-                <w:rFonts w:ascii="Times New Roman" w:hAnsi="Times New Roman"/>
-                <w:sz w:val="20"/>
-              </w:rPr>
-              <w:t>Figure 4</w:t>
-            </w:r>
-          </w:p>
-        </w:tc>
-        <w:tc>
-          <w:tcPr>
-            <w:tcW w:w="6400" w:type="dxa"/>
-            <w:vAlign w:val="center"/>
-          </w:tcPr>
-          <w:p>
-            <w:pPr>
-              <w:spacing w:before="60" w:after="60" w:line="240" w:lineRule="auto"/>
-              <w:jc w:val="left"/>
-              <w:rPr>
-                <w:rFonts w:ascii="Times New Roman" w:hAnsi="Times New Roman"/>
-                <w:sz w:val="20"/>
-              </w:rPr>
-            </w:pPr>
-            <w:r>
-              <w:rPr>
-                <w:rFonts w:ascii="Times New Roman" w:hAnsi="Times New Roman"/>
-                <w:sz w:val="20"/>
-              </w:rPr>
-              <w:t>Safe Pantry-to-Plate Recipe Generation with Cross-Contamination Tips</w:t>
-            </w:r>
-          </w:p>
-        </w:tc>
-        <w:tc>
-          <w:tcPr>
-            <w:tcW w:w="1200" w:type="dxa"/>
-            <w:vAlign w:val="center"/>
-          </w:tcPr>
-          <w:p>
-            <w:pPr>
-              <w:spacing w:before="60" w:after="60" w:line="240" w:lineRule="auto"/>
-              <w:jc w:val="center"/>
-              <w:rPr>
-                <w:rFonts w:ascii="Times New Roman" w:hAnsi="Times New Roman"/>
-                <w:sz w:val="20"/>
-              </w:rPr>
-            </w:pPr>
-            <w:r>
-              <w:rPr>
-                <w:rFonts w:ascii="Times New Roman" w:hAnsi="Times New Roman"/>
-                <w:sz w:val="20"/>
-              </w:rPr>
-              <w:t>11</w:t>
-            </w:r>
-          </w:p>
-        </w:tc>
-      </w:tr>
-      <w:tr>
-        <w:tc>
-          <w:tcPr>
-            <w:tcW w:w="1600" w:type="dxa"/>
-            <w:vAlign w:val="center"/>
-          </w:tcPr>
-          <w:p>
-            <w:pPr>
-              <w:spacing w:before="60" w:after="60" w:line="240" w:lineRule="auto"/>
-              <w:jc w:val="left"/>
-              <w:rPr>
-                <w:rFonts w:ascii="Times New Roman" w:hAnsi="Times New Roman"/>
-                <w:sz w:val="20"/>
-              </w:rPr>
-            </w:pPr>
-            <w:r>
-              <w:rPr>
-                <w:rFonts w:ascii="Times New Roman" w:hAnsi="Times New Roman"/>
-                <w:sz w:val="20"/>
-              </w:rPr>
-              <w:t>Figure 5</w:t>
-            </w:r>
-          </w:p>
-        </w:tc>
-        <w:tc>
-          <w:tcPr>
-            <w:tcW w:w="6400" w:type="dxa"/>
-            <w:vAlign w:val="center"/>
-          </w:tcPr>
-          <w:p>
-            <w:pPr>
-              <w:spacing w:before="60" w:after="60" w:line="240" w:lineRule="auto"/>
-              <w:jc w:val="left"/>
-              <w:rPr>
-                <w:rFonts w:ascii="Times New Roman" w:hAnsi="Times New Roman"/>
-                <w:sz w:val="20"/>
-              </w:rPr>
-            </w:pPr>
-            <w:r>
-              <w:rPr>
-                <w:rFonts w:ascii="Times New Roman" w:hAnsi="Times New Roman"/>
-                <w:sz w:val="20"/>
-              </w:rPr>
-              <w:t>Zero-Egress System Architecture &amp; Edge AI Execution Flow</w:t>
-            </w:r>
-          </w:p>
-        </w:tc>
-        <w:tc>
-          <w:tcPr>
-            <w:tcW w:w="1200" w:type="dxa"/>
-            <w:vAlign w:val="center"/>
-          </w:tcPr>
-          <w:p>
-            <w:pPr>
-              <w:spacing w:before="60" w:after="60" w:line="240" w:lineRule="auto"/>
-              <w:jc w:val="center"/>
-              <w:rPr>
-                <w:rFonts w:ascii="Times New Roman" w:hAnsi="Times New Roman"/>
-                <w:sz w:val="20"/>
-              </w:rPr>
-            </w:pPr>
-            <w:r>
-              <w:rPr>
-                <w:rFonts w:ascii="Times New Roman" w:hAnsi="Times New Roman"/>
-                <w:sz w:val="20"/>
-              </w:rPr>
-              <w:t>12</w:t>
-            </w:r>
-          </w:p>
-        </w:tc>
-      </w:tr>
-      <w:tr>
-        <w:tc>
-          <w:tcPr>
-            <w:tcW w:w="1600" w:type="dxa"/>
-            <w:vAlign w:val="center"/>
-          </w:tcPr>
-          <w:p>
-            <w:pPr>
-              <w:spacing w:before="60" w:after="60" w:line="240" w:lineRule="auto"/>
-              <w:jc w:val="left"/>
-              <w:rPr>
-                <w:rFonts w:ascii="Times New Roman" w:hAnsi="Times New Roman"/>
-                <w:sz w:val="20"/>
-              </w:rPr>
-            </w:pPr>
-            <w:r>
-              <w:rPr>
-                <w:rFonts w:ascii="Times New Roman" w:hAnsi="Times New Roman"/>
-                <w:sz w:val="20"/>
-              </w:rPr>
-              <w:t>Figure 6</w:t>
-            </w:r>
-          </w:p>
-        </w:tc>
-        <w:tc>
-          <w:tcPr>
-            <w:tcW w:w="6400" w:type="dxa"/>
-            <w:vAlign w:val="center"/>
-          </w:tcPr>
-          <w:p>
-            <w:pPr>
-              <w:spacing w:before="60" w:after="60" w:line="240" w:lineRule="auto"/>
-              <w:jc w:val="left"/>
-              <w:rPr>
-                <w:rFonts w:ascii="Times New Roman" w:hAnsi="Times New Roman"/>
-                <w:sz w:val="20"/>
-              </w:rPr>
-            </w:pPr>
-            <w:r>
-              <w:rPr>
-                <w:rFonts w:ascii="Times New Roman" w:hAnsi="Times New Roman"/>
-                <w:sz w:val="20"/>
-              </w:rPr>
-              <w:t>Structured System Prompt Template Enforcing Safety Directives</w:t>
-            </w:r>
-          </w:p>
-        </w:tc>
-        <w:tc>
-          <w:tcPr>
-            <w:tcW w:w="1200" w:type="dxa"/>
-            <w:vAlign w:val="center"/>
-          </w:tcPr>
-          <w:p>
-            <w:pPr>
-              <w:spacing w:before="60" w:after="60" w:line="240" w:lineRule="auto"/>
-              <w:jc w:val="center"/>
-              <w:rPr>
-                <w:rFonts w:ascii="Times New Roman" w:hAnsi="Times New Roman"/>
-                <w:sz w:val="20"/>
-              </w:rPr>
-            </w:pPr>
-            <w:r>
-              <w:rPr>
-                <w:rFonts w:ascii="Times New Roman" w:hAnsi="Times New Roman"/>
-                <w:sz w:val="20"/>
-              </w:rPr>
-              <w:t>12</w:t>
-            </w:r>
-          </w:p>
-        </w:tc>
-      </w:tr>
-      <w:tr>
-        <w:tc>
-          <w:tcPr>
-            <w:tcW w:w="1600" w:type="dxa"/>
-            <w:vAlign w:val="center"/>
-          </w:tcPr>
-          <w:p>
-            <w:pPr>
-              <w:spacing w:before="60" w:after="60" w:line="240" w:lineRule="auto"/>
-              <w:jc w:val="left"/>
-              <w:rPr>
-                <w:rFonts w:ascii="Times New Roman" w:hAnsi="Times New Roman"/>
-                <w:sz w:val="20"/>
-              </w:rPr>
-            </w:pPr>
-            <w:r>
-              <w:rPr>
-                <w:rFonts w:ascii="Times New Roman" w:hAnsi="Times New Roman"/>
-                <w:sz w:val="20"/>
-              </w:rPr>
-              <w:t>Figure 7</w:t>
-            </w:r>
-          </w:p>
-        </w:tc>
-        <w:tc>
-          <w:tcPr>
-            <w:tcW w:w="6400" w:type="dxa"/>
-            <w:vAlign w:val="center"/>
-          </w:tcPr>
-          <w:p>
-            <w:pPr>
-              <w:spacing w:before="60" w:after="60" w:line="240" w:lineRule="auto"/>
-              <w:jc w:val="left"/>
-              <w:rPr>
-                <w:rFonts w:ascii="Times New Roman" w:hAnsi="Times New Roman"/>
-                <w:sz w:val="20"/>
-              </w:rPr>
-            </w:pPr>
-            <w:r>
-              <w:rPr>
-                <w:rFonts w:ascii="Times New Roman" w:hAnsi="Times New Roman"/>
-                <w:sz w:val="20"/>
-              </w:rPr>
-              <w:t>Empirical 15-Point Allergen Detection Benchmark Suite Results</w:t>
-            </w:r>
-          </w:p>
-        </w:tc>
-        <w:tc>
-          <w:tcPr>
-            <w:tcW w:w="1200" w:type="dxa"/>
-            <w:vAlign w:val="center"/>
-          </w:tcPr>
-          <w:p>
-            <w:pPr>
-              <w:spacing w:before="60" w:after="60" w:line="240" w:lineRule="auto"/>
-              <w:jc w:val="center"/>
-              <w:rPr>
-                <w:rFonts w:ascii="Times New Roman" w:hAnsi="Times New Roman"/>
-                <w:sz w:val="20"/>
-              </w:rPr>
-            </w:pPr>
-            <w:r>
-              <w:rPr>
-                <w:rFonts w:ascii="Times New Roman" w:hAnsi="Times New Roman"/>
-                <w:sz w:val="20"/>
-              </w:rPr>
-              <w:t>13</w:t>
+              <w:t>15</w:t>
             </w:r>
           </w:p>
         </w:tc>
@@ -1784,7 +1500,7 @@
                 <w:rFonts w:ascii="Times New Roman" w:hAnsi="Times New Roman"/>
                 <w:sz w:val="20"/>
               </w:rPr>
-              <w:t>5</w:t>
+              <w:t>4</w:t>
             </w:r>
           </w:p>
         </w:tc>
@@ -1926,7 +1642,7 @@
                 <w:rFonts w:ascii="Times New Roman" w:hAnsi="Times New Roman"/>
                 <w:sz w:val="20"/>
               </w:rPr>
-              <w:t>6</w:t>
+              <w:t>7</w:t>
             </w:r>
           </w:p>
         </w:tc>
@@ -1997,7 +1713,7 @@
                 <w:rFonts w:ascii="Times New Roman" w:hAnsi="Times New Roman"/>
                 <w:sz w:val="20"/>
               </w:rPr>
-              <w:t>7</w:t>
+              <w:t>8</w:t>
             </w:r>
           </w:p>
         </w:tc>
@@ -2068,7 +1784,7 @@
                 <w:rFonts w:ascii="Times New Roman" w:hAnsi="Times New Roman"/>
                 <w:sz w:val="20"/>
               </w:rPr>
-              <w:t>8</w:t>
+              <w:t>10</w:t>
             </w:r>
           </w:p>
         </w:tc>
@@ -2139,7 +1855,7 @@
                 <w:rFonts w:ascii="Times New Roman" w:hAnsi="Times New Roman"/>
                 <w:sz w:val="20"/>
               </w:rPr>
-              <w:t>10</w:t>
+              <w:t>11</w:t>
             </w:r>
           </w:p>
         </w:tc>
@@ -2210,7 +1926,7 @@
                 <w:rFonts w:ascii="Times New Roman" w:hAnsi="Times New Roman"/>
                 <w:sz w:val="20"/>
               </w:rPr>
-              <w:t>12</w:t>
+              <w:t>13</w:t>
             </w:r>
           </w:p>
         </w:tc>
@@ -2281,7 +1997,7 @@
                 <w:rFonts w:ascii="Times New Roman" w:hAnsi="Times New Roman"/>
                 <w:sz w:val="20"/>
               </w:rPr>
-              <w:t>14</w:t>
+              <w:t>16</w:t>
             </w:r>
           </w:p>
         </w:tc>
@@ -2352,7 +2068,7 @@
                 <w:rFonts w:ascii="Times New Roman" w:hAnsi="Times New Roman"/>
                 <w:sz w:val="20"/>
               </w:rPr>
-              <w:t>15</w:t>
+              <w:t>17</w:t>
             </w:r>
           </w:p>
         </w:tc>
@@ -7171,6 +6887,85 @@
     </w:p>
     <w:p>
       <w:pPr>
+        <w:spacing w:before="140" w:after="60"/>
+        <w:jc w:val="center"/>
+      </w:pPr>
+      <w:r>
+        <w:rPr>
+          <w:noProof/>
+        </w:rPr>
+        <w:drawing>
+          <wp:inline distT="0" distB="0" distL="0" distR="0">
+            <wp:extent cx="5200000" cy="3450000"/>
+            <wp:effectExtent l="0" t="0" r="0" b="0"/>
+            <wp:docPr id="190066" name="Figure"/>
+            <wp:cNvGraphicFramePr>
+              <a:graphicFrameLocks xmlns:a="http://schemas.openxmlformats.org/drawingml/2006/main" noChangeAspect="1"/>
+            </wp:cNvGraphicFramePr>
+            <a:graphic xmlns:a="http://schemas.openxmlformats.org/drawingml/2006/main">
+              <a:graphicData uri="http://schemas.openxmlformats.org/drawingml/2006/picture">
+                <pic:pic xmlns:pic="http://schemas.openxmlformats.org/drawingml/2006/picture">
+                  <pic:nvPicPr>
+                    <pic:cNvPr id="0" name="figure.png"/>
+                    <pic:cNvPicPr/>
+                  </pic:nvPicPr>
+                  <pic:blipFill>
+                    <a:blip xmlns:r="http://schemas.openxmlformats.org/officeDocument/2006/relationships" r:embed="rId10"/>
+                    <a:stretch>
+                      <a:fillRect/>
+                    </a:stretch>
+                  </pic:blipFill>
+                  <pic:spPr>
+                    <a:xfrm>
+                      <a:off x="0" y="0"/>
+                      <a:ext cx="5200000" cy="3450000"/>
+                    </a:xfrm>
+                    <a:prstGeom prst="rect">
+                      <a:avLst/>
+                    </a:prstGeom>
+                  </pic:spPr>
+                </pic:pic>
+              </a:graphicData>
+            </a:graphic>
+          </wp:inline>
+        </w:drawing>
+      </w:r>
+    </w:p>
+    <w:p>
+      <w:pPr>
+        <w:spacing w:before="0" w:after="180" w:line="360" w:lineRule="auto"/>
+        <w:jc w:val="center"/>
+        <w:rPr>
+          <w:rFonts w:ascii="Times New Roman" w:hAnsi="Times New Roman" w:cs="Times New Roman"/>
+          <w:b/>
+          <w:bCs/>
+          <w:color w:val="000000"/>
+          <w:sz w:val="24"/>
+          <w:szCs w:val="24"/>
+        </w:rPr>
+      </w:pPr>
+      <w:r>
+        <w:rPr>
+          <w:rFonts w:ascii="Times New Roman" w:hAnsi="Times New Roman" w:cs="Times New Roman"/>
+          <w:b/>
+          <w:bCs/>
+          <w:color w:val="000000"/>
+          <w:sz w:val="24"/>
+          <w:szCs w:val="24"/>
+        </w:rPr>
+        <w:t xml:space="preserve">Figure 1  SafeBite Editorial User Interface and Local Model Health Telemetry</w:t>
+      </w:r>
+    </w:p>
+    <w:p>
+      <w:pPr>
+        <w:spacing w:after="0" w:line="240" w:lineRule="auto"/>
+      </w:pPr>
+      <w:r>
+        <w:br w:type="page"/>
+      </w:r>
+    </w:p>
+    <w:p>
+      <w:pPr>
         <w:spacing w:before="180" w:after="100" w:line="360" w:lineRule="auto"/>
         <w:jc w:val="left"/>
         <w:rPr>
@@ -7221,6 +7016,73 @@
         <w:jc w:val="both"/>
         <w:rPr>
           <w:rFonts w:ascii="Times New Roman" w:hAnsi="Times New Roman" w:cs="Times New Roman"/>
+          <w:color w:val="000000"/>
+          <w:sz w:val="24"/>
+          <w:szCs w:val="24"/>
+        </w:rPr>
+      </w:pPr>
+      <w:r>
+        <w:rPr>
+          <w:rFonts w:ascii="Times New Roman" w:hAnsi="Times New Roman" w:cs="Times New Roman"/>
+          <w:color w:val="000000"/>
+          <w:sz w:val="24"/>
+          <w:szCs w:val="24"/>
+        </w:rPr>
+        <w:t xml:space="preserve">Gemma 2 Analysis Output: The local model identifies both hidden dairy (hydrolyzed whey protein) and hidden gluten (soy sauce wheat powder), issuing a red [UNSAFE / DANGER] verdict with direct medical counsel.</w:t>
+      </w:r>
+    </w:p>
+    <w:p>
+      <w:pPr>
+        <w:spacing w:before="140" w:after="60"/>
+        <w:jc w:val="center"/>
+      </w:pPr>
+      <w:r>
+        <w:rPr>
+          <w:noProof/>
+        </w:rPr>
+        <w:drawing>
+          <wp:inline distT="0" distB="0" distL="0" distR="0">
+            <wp:extent cx="5200000" cy="3450000"/>
+            <wp:effectExtent l="0" t="0" r="0" b="0"/>
+            <wp:docPr id="731232" name="Figure"/>
+            <wp:cNvGraphicFramePr>
+              <a:graphicFrameLocks xmlns:a="http://schemas.openxmlformats.org/drawingml/2006/main" noChangeAspect="1"/>
+            </wp:cNvGraphicFramePr>
+            <a:graphic xmlns:a="http://schemas.openxmlformats.org/drawingml/2006/main">
+              <a:graphicData uri="http://schemas.openxmlformats.org/drawingml/2006/picture">
+                <pic:pic xmlns:pic="http://schemas.openxmlformats.org/drawingml/2006/picture">
+                  <pic:nvPicPr>
+                    <pic:cNvPr id="0" name="figure.png"/>
+                    <pic:cNvPicPr/>
+                  </pic:nvPicPr>
+                  <pic:blipFill>
+                    <a:blip xmlns:r="http://schemas.openxmlformats.org/officeDocument/2006/relationships" r:embed="rId11"/>
+                    <a:stretch>
+                      <a:fillRect/>
+                    </a:stretch>
+                  </pic:blipFill>
+                  <pic:spPr>
+                    <a:xfrm>
+                      <a:off x="0" y="0"/>
+                      <a:ext cx="5200000" cy="3450000"/>
+                    </a:xfrm>
+                    <a:prstGeom prst="rect">
+                      <a:avLst/>
+                    </a:prstGeom>
+                  </pic:spPr>
+                </pic:pic>
+              </a:graphicData>
+            </a:graphic>
+          </wp:inline>
+        </w:drawing>
+      </w:r>
+    </w:p>
+    <w:p>
+      <w:pPr>
+        <w:spacing w:before="0" w:after="180" w:line="360" w:lineRule="auto"/>
+        <w:jc w:val="center"/>
+        <w:rPr>
+          <w:rFonts w:ascii="Times New Roman" w:hAnsi="Times New Roman" w:cs="Times New Roman"/>
           <w:b/>
           <w:bCs/>
           <w:color w:val="000000"/>
@@ -7237,32 +7099,15 @@
           <w:sz w:val="24"/>
           <w:szCs w:val="24"/>
         </w:rPr>
-        <w:t xml:space="preserve">Gemma 2 Analysis Output:</w:t>
-      </w:r>
-    </w:p>
-    <w:p>
-      <w:pPr>
-        <w:spacing w:before="0" w:after="140" w:line="240" w:lineRule="auto"/>
-        <w:jc w:val="both"/>
-        <w:rPr>
-          <w:rFonts w:ascii="Courier New" w:hAnsi="Courier New" w:cs="Courier New"/>
-          <w:color w:val="000000"/>
-          <w:sz w:val="18"/>
-          <w:szCs w:val="18"/>
-        </w:rPr>
-      </w:pPr>
-      <w:r>
-        <w:rPr>
-          <w:rFonts w:ascii="Courier New" w:hAnsi="Courier New" w:cs="Courier New"/>
-          <w:color w:val="000000"/>
-          <w:sz w:val="18"/>
-          <w:szCs w:val="18"/>
-        </w:rPr>
-        <w:t xml:space="preserve">**SAFETY VERDICT**: [UNSAFE / DANGER]
-**FLAGGED INGREDIENTS**:
-• Hydrolyzed whey protein: Contains dairy (lactose) and poses an acute reaction risk.
-• Soy sauce powder (wheat, soybeans): Contains wheat and soy, directly violating Celiac dietary constraints.
-**ACTIONABLE VERDICT FOR ROOMMATE**: Do not prepare or offer this item to Alex. It contains severe antigens capable of triggering an acute medical reaction.</w:t>
+        <w:t xml:space="preserve">Figure 2  Ingredient Allergen Scanner Result Catching Hidden Derivative Toxins</w:t>
+      </w:r>
+    </w:p>
+    <w:p>
+      <w:pPr>
+        <w:spacing w:after="0" w:line="240" w:lineRule="auto"/>
+      </w:pPr>
+      <w:r>
+        <w:br w:type="page"/>
       </w:r>
     </w:p>
     <w:p>
@@ -7313,28 +7158,94 @@
     </w:p>
     <w:p>
       <w:pPr>
-        <w:spacing w:before="0" w:after="140" w:line="240" w:lineRule="auto"/>
+        <w:spacing w:before="0" w:after="120" w:line="360" w:lineRule="auto"/>
         <w:jc w:val="both"/>
         <w:rPr>
-          <w:rFonts w:ascii="Courier New" w:hAnsi="Courier New" w:cs="Courier New"/>
-          <w:color w:val="000000"/>
-          <w:sz w:val="18"/>
-          <w:szCs w:val="18"/>
-        </w:rPr>
-      </w:pPr>
-      <w:r>
-        <w:rPr>
-          <w:rFonts w:ascii="Courier New" w:hAnsi="Courier New" w:cs="Courier New"/>
-          <w:color w:val="000000"/>
-          <w:sz w:val="18"/>
-          <w:szCs w:val="18"/>
-        </w:rPr>
-        <w:t xml:space="preserve">Recipe Generated: Sweet &amp; Spicy Ginger Chicken Bowls
-Allergen Guarantee: 100% gluten-free, dairy-free, and peanut-free.
-Cross-Contamination Protocol:
-• Dedicated Cutting Boards: Use separate boards for raw poultry and vegetables.
-• Clean Sponges: Use fresh sponges to avoid cross-contact from prior dairy/gluten prep.
-• Utensil Sanitation: Wash all skillets in hot soapy water prior to cooking.</w:t>
+          <w:rFonts w:ascii="Times New Roman" w:hAnsi="Times New Roman" w:cs="Times New Roman"/>
+          <w:color w:val="000000"/>
+          <w:sz w:val="24"/>
+          <w:szCs w:val="24"/>
+        </w:rPr>
+      </w:pPr>
+      <w:r>
+        <w:rPr>
+          <w:rFonts w:ascii="Times New Roman" w:hAnsi="Times New Roman" w:cs="Times New Roman"/>
+          <w:color w:val="000000"/>
+          <w:sz w:val="24"/>
+          <w:szCs w:val="24"/>
+        </w:rPr>
+        <w:t xml:space="preserve">Recipe Generated: Sweet &amp; Spicy Ginger Chicken Bowls. SafeBite synthesizes a full recipe guaranteed 100% allergen-free alongside essential kitchen cross-contamination tips (dedicated cutting boards and separate sponges).</w:t>
+      </w:r>
+    </w:p>
+    <w:p>
+      <w:pPr>
+        <w:spacing w:before="140" w:after="60"/>
+        <w:jc w:val="center"/>
+      </w:pPr>
+      <w:r>
+        <w:rPr>
+          <w:noProof/>
+        </w:rPr>
+        <w:drawing>
+          <wp:inline distT="0" distB="0" distL="0" distR="0">
+            <wp:extent cx="5200000" cy="3450000"/>
+            <wp:effectExtent l="0" t="0" r="0" b="0"/>
+            <wp:docPr id="609478" name="Figure"/>
+            <wp:cNvGraphicFramePr>
+              <a:graphicFrameLocks xmlns:a="http://schemas.openxmlformats.org/drawingml/2006/main" noChangeAspect="1"/>
+            </wp:cNvGraphicFramePr>
+            <a:graphic xmlns:a="http://schemas.openxmlformats.org/drawingml/2006/main">
+              <a:graphicData uri="http://schemas.openxmlformats.org/drawingml/2006/picture">
+                <pic:pic xmlns:pic="http://schemas.openxmlformats.org/drawingml/2006/picture">
+                  <pic:nvPicPr>
+                    <pic:cNvPr id="0" name="figure.png"/>
+                    <pic:cNvPicPr/>
+                  </pic:nvPicPr>
+                  <pic:blipFill>
+                    <a:blip xmlns:r="http://schemas.openxmlformats.org/officeDocument/2006/relationships" r:embed="rId12"/>
+                    <a:stretch>
+                      <a:fillRect/>
+                    </a:stretch>
+                  </pic:blipFill>
+                  <pic:spPr>
+                    <a:xfrm>
+                      <a:off x="0" y="0"/>
+                      <a:ext cx="5200000" cy="3450000"/>
+                    </a:xfrm>
+                    <a:prstGeom prst="rect">
+                      <a:avLst/>
+                    </a:prstGeom>
+                  </pic:spPr>
+                </pic:pic>
+              </a:graphicData>
+            </a:graphic>
+          </wp:inline>
+        </w:drawing>
+      </w:r>
+    </w:p>
+    <w:p>
+      <w:pPr>
+        <w:spacing w:before="0" w:after="180" w:line="360" w:lineRule="auto"/>
+        <w:jc w:val="center"/>
+        <w:rPr>
+          <w:rFonts w:ascii="Times New Roman" w:hAnsi="Times New Roman" w:cs="Times New Roman"/>
+          <w:b/>
+          <w:bCs/>
+          <w:color w:val="000000"/>
+          <w:sz w:val="24"/>
+          <w:szCs w:val="24"/>
+        </w:rPr>
+      </w:pPr>
+      <w:r>
+        <w:rPr>
+          <w:rFonts w:ascii="Times New Roman" w:hAnsi="Times New Roman" w:cs="Times New Roman"/>
+          <w:b/>
+          <w:bCs/>
+          <w:color w:val="000000"/>
+          <w:sz w:val="24"/>
+          <w:szCs w:val="24"/>
+        </w:rPr>
+        <w:t xml:space="preserve">Figure 3  Safe Pantry-to-Plate Recipe Generation with Cross-Contamination Directives</w:t>
       </w:r>
     </w:p>
     <w:p>

</xml_diff>